<commit_message>
- DepartmentId in Admin Area - corrected
</commit_message>
<xml_diff>
--- a/ExaminerB/.appCatalog/_ExaminerManual.docx
+++ b/ExaminerB/.appCatalog/_ExaminerManual.docx
@@ -111,63 +111,6 @@
                 <w:szCs w:val="18"/>
               </w:rPr>
             </w:pPr>
-            <w:r>
-              <w:rPr>
-                <w:rFonts w:ascii="Segoe UI" w:hAnsi="Segoe UI" w:cs="Segoe UI"/>
-                <w:b/>
-                <w:bCs/>
-                <w:sz w:val="18"/>
-                <w:szCs w:val="18"/>
-              </w:rPr>
-              <w:drawing>
-                <wp:inline distT="0" distB="0" distL="0" distR="0" wp14:anchorId="3AE7BBB0" wp14:editId="1C5A8E2F">
-                  <wp:extent cx="1218079" cy="1033670"/>
-                  <wp:effectExtent l="19050" t="0" r="20320" b="319405"/>
-                  <wp:docPr id="1451222307" name="Picture 1"/>
-                  <wp:cNvGraphicFramePr>
-                    <a:graphicFrameLocks xmlns:a="http://schemas.openxmlformats.org/drawingml/2006/main" noChangeAspect="1"/>
-                  </wp:cNvGraphicFramePr>
-                  <a:graphic xmlns:a="http://schemas.openxmlformats.org/drawingml/2006/main">
-                    <a:graphicData uri="http://schemas.openxmlformats.org/drawingml/2006/picture">
-                      <pic:pic xmlns:pic="http://schemas.openxmlformats.org/drawingml/2006/picture">
-                        <pic:nvPicPr>
-                          <pic:cNvPr id="1451222307" name=""/>
-                          <pic:cNvPicPr/>
-                        </pic:nvPicPr>
-                        <pic:blipFill>
-                          <a:blip r:embed="rId6"/>
-                          <a:stretch>
-                            <a:fillRect/>
-                          </a:stretch>
-                        </pic:blipFill>
-                        <pic:spPr>
-                          <a:xfrm>
-                            <a:off x="0" y="0"/>
-                            <a:ext cx="1250177" cy="1060909"/>
-                          </a:xfrm>
-                          <a:prstGeom prst="roundRect">
-                            <a:avLst>
-                              <a:gd name="adj" fmla="val 8594"/>
-                            </a:avLst>
-                          </a:prstGeom>
-                          <a:solidFill>
-                            <a:srgbClr val="FFFFFF">
-                              <a:shade val="85000"/>
-                            </a:srgbClr>
-                          </a:solidFill>
-                          <a:ln>
-                            <a:noFill/>
-                          </a:ln>
-                          <a:effectLst>
-                            <a:reflection blurRad="12700" stA="38000" endPos="28000" dist="5000" dir="5400000" sy="-100000" algn="bl" rotWithShape="0"/>
-                          </a:effectLst>
-                        </pic:spPr>
-                      </pic:pic>
-                    </a:graphicData>
-                  </a:graphic>
-                </wp:inline>
-              </w:drawing>
-            </w:r>
           </w:p>
         </w:tc>
       </w:tr>
@@ -245,7 +188,7 @@
         </w:rPr>
         <w:t xml:space="preserve">Access: </w:t>
       </w:r>
-      <w:hyperlink r:id="rId7" w:tgtFrame="_blank" w:history="1">
+      <w:hyperlink r:id="rId6" w:tgtFrame="_blank" w:history="1">
         <w:r>
           <w:rPr>
             <w:rStyle w:val="Hyperlink"/>
@@ -1886,7 +1829,6 @@
           <w:sz w:val="18"/>
           <w:szCs w:val="18"/>
         </w:rPr>
-        <w:lastRenderedPageBreak/>
         <w:t>3. Teacher Workflow</w:t>
       </w:r>
     </w:p>
@@ -1929,7 +1871,7 @@
         </w:rPr>
         <w:t xml:space="preserve">→ </w:t>
       </w:r>
-      <w:hyperlink r:id="rId8" w:tgtFrame="_blank" w:history="1">
+      <w:hyperlink r:id="rId7" w:tgtFrame="_blank" w:history="1">
         <w:r>
           <w:rPr>
             <w:rStyle w:val="Hyperlink"/>
@@ -1968,6 +1910,7 @@
           <w:sz w:val="18"/>
           <w:szCs w:val="18"/>
         </w:rPr>
+        <w:lastRenderedPageBreak/>
         <w:t>Main Dashboard</w:t>
       </w:r>
     </w:p>
@@ -2623,7 +2566,6 @@
           <w:sz w:val="18"/>
           <w:szCs w:val="18"/>
         </w:rPr>
-        <w:lastRenderedPageBreak/>
         <w:t>Exam Management Icons (on exam list)</w:t>
       </w:r>
     </w:p>
@@ -2716,9 +2658,11 @@
             <w:r>
               <w:rPr>
                 <w:rFonts w:ascii="Segoe UI Symbol" w:hAnsi="Segoe UI Symbol" w:cs="Segoe UI Symbol"/>
-                <w:sz w:val="18"/>
-                <w:szCs w:val="18"/>
-              </w:rPr>
+                <w:noProof/>
+                <w:sz w:val="18"/>
+                <w:szCs w:val="18"/>
+              </w:rPr>
+              <w:lastRenderedPageBreak/>
               <w:drawing>
                 <wp:inline distT="0" distB="0" distL="0" distR="0" wp14:anchorId="51B432D1" wp14:editId="090E6F2B">
                   <wp:extent cx="295316" cy="219106"/>
@@ -2735,7 +2679,7 @@
                           <pic:cNvPicPr/>
                         </pic:nvPicPr>
                         <pic:blipFill>
-                          <a:blip r:embed="rId9"/>
+                          <a:blip r:embed="rId8"/>
                           <a:stretch>
                             <a:fillRect/>
                           </a:stretch>
@@ -2802,6 +2746,7 @@
             <w:r>
               <w:rPr>
                 <w:rFonts w:ascii="Segoe UI Emoji" w:hAnsi="Segoe UI Emoji" w:cs="Segoe UI Emoji"/>
+                <w:noProof/>
                 <w:sz w:val="18"/>
                 <w:szCs w:val="18"/>
               </w:rPr>
@@ -2821,7 +2766,7 @@
                           <pic:cNvPicPr/>
                         </pic:nvPicPr>
                         <pic:blipFill>
-                          <a:blip r:embed="rId10"/>
+                          <a:blip r:embed="rId9"/>
                           <a:stretch>
                             <a:fillRect/>
                           </a:stretch>
@@ -2888,6 +2833,7 @@
             <w:r>
               <w:rPr>
                 <w:rFonts w:ascii="Segoe UI Emoji" w:hAnsi="Segoe UI Emoji" w:cs="Segoe UI Emoji"/>
+                <w:noProof/>
                 <w:sz w:val="18"/>
                 <w:szCs w:val="18"/>
               </w:rPr>
@@ -2907,7 +2853,7 @@
                           <pic:cNvPicPr/>
                         </pic:nvPicPr>
                         <pic:blipFill>
-                          <a:blip r:embed="rId11"/>
+                          <a:blip r:embed="rId10"/>
                           <a:stretch>
                             <a:fillRect/>
                           </a:stretch>
@@ -2974,6 +2920,7 @@
             <w:r>
               <w:rPr>
                 <w:rFonts w:ascii="Segoe UI Emoji" w:hAnsi="Segoe UI Emoji" w:cs="Segoe UI Emoji"/>
+                <w:noProof/>
                 <w:sz w:val="18"/>
                 <w:szCs w:val="18"/>
               </w:rPr>
@@ -2993,7 +2940,7 @@
                           <pic:cNvPicPr/>
                         </pic:nvPicPr>
                         <pic:blipFill>
-                          <a:blip r:embed="rId12"/>
+                          <a:blip r:embed="rId11"/>
                           <a:stretch>
                             <a:fillRect/>
                           </a:stretch>
@@ -3060,6 +3007,7 @@
             <w:r>
               <w:rPr>
                 <w:rFonts w:ascii="Segoe UI Emoji" w:hAnsi="Segoe UI Emoji" w:cs="Segoe UI Emoji"/>
+                <w:noProof/>
                 <w:sz w:val="18"/>
                 <w:szCs w:val="18"/>
               </w:rPr>
@@ -3079,7 +3027,7 @@
                           <pic:cNvPicPr/>
                         </pic:nvPicPr>
                         <pic:blipFill>
-                          <a:blip r:embed="rId13"/>
+                          <a:blip r:embed="rId12"/>
                           <a:stretch>
                             <a:fillRect/>
                           </a:stretch>
@@ -3146,6 +3094,7 @@
             <w:r>
               <w:rPr>
                 <w:rFonts w:ascii="Segoe UI Symbol" w:hAnsi="Segoe UI Symbol" w:cs="Segoe UI Symbol"/>
+                <w:noProof/>
                 <w:sz w:val="18"/>
                 <w:szCs w:val="18"/>
               </w:rPr>
@@ -3165,7 +3114,7 @@
                           <pic:cNvPicPr/>
                         </pic:nvPicPr>
                         <pic:blipFill>
-                          <a:blip r:embed="rId14"/>
+                          <a:blip r:embed="rId13"/>
                           <a:stretch>
                             <a:fillRect/>
                           </a:stretch>
@@ -3232,6 +3181,7 @@
             <w:r>
               <w:rPr>
                 <w:rFonts w:ascii="Segoe UI Symbol" w:hAnsi="Segoe UI Symbol" w:cs="Segoe UI Symbol"/>
+                <w:noProof/>
                 <w:sz w:val="18"/>
                 <w:szCs w:val="18"/>
               </w:rPr>
@@ -3251,7 +3201,7 @@
                           <pic:cNvPicPr/>
                         </pic:nvPicPr>
                         <pic:blipFill>
-                          <a:blip r:embed="rId15"/>
+                          <a:blip r:embed="rId14"/>
                           <a:stretch>
                             <a:fillRect/>
                           </a:stretch>
@@ -3583,7 +3533,7 @@
           <w:szCs w:val="18"/>
         </w:rPr>
       </w:pPr>
-      <w:hyperlink r:id="rId16" w:tgtFrame="_blank" w:history="1">
+      <w:hyperlink r:id="rId15" w:tgtFrame="_blank" w:history="1">
         <w:r>
           <w:rPr>
             <w:rStyle w:val="Hyperlink"/>
@@ -3798,7 +3748,6 @@
           <w:sz w:val="18"/>
           <w:szCs w:val="18"/>
         </w:rPr>
-        <w:lastRenderedPageBreak/>
         <w:t>After Submission</w:t>
       </w:r>
     </w:p>
@@ -3843,6 +3792,7 @@
           <w:sz w:val="18"/>
           <w:szCs w:val="18"/>
         </w:rPr>
+        <w:lastRenderedPageBreak/>
         <w:t>If permitted by teacher: full exam review with correct answers</w:t>
       </w:r>
     </w:p>
@@ -4306,6 +4256,16 @@
       <w:pPr>
         <w:jc w:val="center"/>
         <w:rPr>
+          <w:rFonts w:ascii="Segoe UI" w:hAnsi="Segoe UI" w:cs="B Zar"/>
+          <w:b/>
+          <w:bCs/>
+          <w:sz w:val="36"/>
+          <w:szCs w:val="36"/>
+          <w:rtl/>
+        </w:rPr>
+      </w:pPr>
+      <w:r>
+        <w:rPr>
           <w:rFonts w:ascii="Segoe UI" w:hAnsi="Segoe UI" w:cs="B Zar" w:hint="cs"/>
           <w:b/>
           <w:bCs/>
@@ -4313,7 +4273,19 @@
           <w:szCs w:val="36"/>
           <w:rtl/>
         </w:rPr>
-      </w:pPr>
+        <w:lastRenderedPageBreak/>
+        <w:t>اپليکيشن اينترنتي آزمونگر (</w:t>
+      </w:r>
+      <w:r>
+        <w:rPr>
+          <w:rFonts w:ascii="Segoe UI" w:hAnsi="Segoe UI" w:cs="B Zar"/>
+          <w:b/>
+          <w:bCs/>
+          <w:sz w:val="36"/>
+          <w:szCs w:val="36"/>
+        </w:rPr>
+        <w:t>Examiner</w:t>
+      </w:r>
       <w:r>
         <w:rPr>
           <w:rFonts w:ascii="Segoe UI" w:hAnsi="Segoe UI" w:cs="B Zar" w:hint="cs"/>
@@ -4323,28 +4295,6 @@
           <w:szCs w:val="36"/>
           <w:rtl/>
         </w:rPr>
-        <w:lastRenderedPageBreak/>
-        <w:t>اپليکيشن اينترنتي آزمونگر (</w:t>
-      </w:r>
-      <w:r>
-        <w:rPr>
-          <w:rFonts w:ascii="Segoe UI" w:hAnsi="Segoe UI" w:cs="B Zar"/>
-          <w:b/>
-          <w:bCs/>
-          <w:sz w:val="36"/>
-          <w:szCs w:val="36"/>
-        </w:rPr>
-        <w:t>Examiner</w:t>
-      </w:r>
-      <w:r>
-        <w:rPr>
-          <w:rFonts w:ascii="Segoe UI" w:hAnsi="Segoe UI" w:cs="B Zar" w:hint="cs"/>
-          <w:b/>
-          <w:bCs/>
-          <w:sz w:val="36"/>
-          <w:szCs w:val="36"/>
-          <w:rtl/>
-        </w:rPr>
         <w:t>)</w:t>
       </w:r>
     </w:p>
@@ -4352,7 +4302,6 @@
       <w:pPr>
         <w:pStyle w:val="Heading1"/>
         <w:rPr>
-          <w:rFonts w:hint="cs"/>
           <w:rtl/>
         </w:rPr>
       </w:pPr>
@@ -5593,66 +5542,12 @@
       <w:pPr>
         <w:jc w:val="center"/>
         <w:rPr>
-          <w:rFonts w:ascii="Segoe UI" w:hAnsi="Segoe UI" w:cs="Segoe UI"/>
-          <w:sz w:val="18"/>
-          <w:szCs w:val="18"/>
-          <w:rtl/>
-        </w:rPr>
-      </w:pPr>
-      <w:r>
-        <w:rPr>
-          <w:rFonts w:ascii="Segoe UI" w:hAnsi="Segoe UI" w:cs="Segoe UI"/>
-          <w:noProof/>
-          <w:sz w:val="18"/>
-          <w:szCs w:val="18"/>
-          <w:rtl/>
-        </w:rPr>
-        <w:drawing>
-          <wp:inline distT="0" distB="0" distL="0" distR="0" wp14:anchorId="149EFB07" wp14:editId="5115FBC4">
-            <wp:extent cx="5303465" cy="2713428"/>
-            <wp:effectExtent l="152400" t="152400" r="354965" b="353695"/>
-            <wp:docPr id="1848073415" name="Picture 1"/>
-            <wp:cNvGraphicFramePr>
-              <a:graphicFrameLocks xmlns:a="http://schemas.openxmlformats.org/drawingml/2006/main" noChangeAspect="1"/>
-            </wp:cNvGraphicFramePr>
-            <a:graphic xmlns:a="http://schemas.openxmlformats.org/drawingml/2006/main">
-              <a:graphicData uri="http://schemas.openxmlformats.org/drawingml/2006/picture">
-                <pic:pic xmlns:pic="http://schemas.openxmlformats.org/drawingml/2006/picture">
-                  <pic:nvPicPr>
-                    <pic:cNvPr id="1848073415" name=""/>
-                    <pic:cNvPicPr/>
-                  </pic:nvPicPr>
-                  <pic:blipFill>
-                    <a:blip r:embed="rId17"/>
-                    <a:stretch>
-                      <a:fillRect/>
-                    </a:stretch>
-                  </pic:blipFill>
-                  <pic:spPr>
-                    <a:xfrm>
-                      <a:off x="0" y="0"/>
-                      <a:ext cx="5312686" cy="2718146"/>
-                    </a:xfrm>
-                    <a:prstGeom prst="rect">
-                      <a:avLst/>
-                    </a:prstGeom>
-                    <a:ln>
-                      <a:noFill/>
-                    </a:ln>
-                    <a:effectLst>
-                      <a:outerShdw blurRad="292100" dist="139700" dir="2700000" algn="tl" rotWithShape="0">
-                        <a:srgbClr val="333333">
-                          <a:alpha val="65000"/>
-                        </a:srgbClr>
-                      </a:outerShdw>
-                    </a:effectLst>
-                  </pic:spPr>
-                </pic:pic>
-              </a:graphicData>
-            </a:graphic>
-          </wp:inline>
-        </w:drawing>
-      </w:r>
+          <w:rFonts w:ascii="Segoe UI" w:hAnsi="Segoe UI" w:cs="Segoe UI" w:hint="cs"/>
+          <w:sz w:val="18"/>
+          <w:szCs w:val="18"/>
+          <w:rtl/>
+        </w:rPr>
+      </w:pPr>
     </w:p>
     <w:p>
       <w:pPr>
@@ -6047,60 +5942,6 @@
           <w:rtl/>
         </w:rPr>
       </w:pPr>
-      <w:r>
-        <w:rPr>
-          <w:rFonts w:ascii="Segoe UI" w:hAnsi="Segoe UI" w:cs="Segoe UI"/>
-          <w:noProof/>
-          <w:sz w:val="18"/>
-          <w:szCs w:val="18"/>
-          <w:rtl/>
-        </w:rPr>
-        <w:drawing>
-          <wp:inline distT="0" distB="0" distL="0" distR="0" wp14:anchorId="51044996" wp14:editId="2C87F20F">
-            <wp:extent cx="2549789" cy="2389517"/>
-            <wp:effectExtent l="152400" t="152400" r="365125" b="353695"/>
-            <wp:docPr id="232249504" name="Picture 1"/>
-            <wp:cNvGraphicFramePr>
-              <a:graphicFrameLocks xmlns:a="http://schemas.openxmlformats.org/drawingml/2006/main" noChangeAspect="1"/>
-            </wp:cNvGraphicFramePr>
-            <a:graphic xmlns:a="http://schemas.openxmlformats.org/drawingml/2006/main">
-              <a:graphicData uri="http://schemas.openxmlformats.org/drawingml/2006/picture">
-                <pic:pic xmlns:pic="http://schemas.openxmlformats.org/drawingml/2006/picture">
-                  <pic:nvPicPr>
-                    <pic:cNvPr id="232249504" name=""/>
-                    <pic:cNvPicPr/>
-                  </pic:nvPicPr>
-                  <pic:blipFill>
-                    <a:blip r:embed="rId18"/>
-                    <a:stretch>
-                      <a:fillRect/>
-                    </a:stretch>
-                  </pic:blipFill>
-                  <pic:spPr>
-                    <a:xfrm>
-                      <a:off x="0" y="0"/>
-                      <a:ext cx="2560132" cy="2399210"/>
-                    </a:xfrm>
-                    <a:prstGeom prst="rect">
-                      <a:avLst/>
-                    </a:prstGeom>
-                    <a:ln>
-                      <a:noFill/>
-                    </a:ln>
-                    <a:effectLst>
-                      <a:outerShdw blurRad="292100" dist="139700" dir="2700000" algn="tl" rotWithShape="0">
-                        <a:srgbClr val="333333">
-                          <a:alpha val="65000"/>
-                        </a:srgbClr>
-                      </a:outerShdw>
-                    </a:effectLst>
-                  </pic:spPr>
-                </pic:pic>
-              </a:graphicData>
-            </a:graphic>
-          </wp:inline>
-        </w:drawing>
-      </w:r>
     </w:p>
     <w:p>
       <w:pPr>
@@ -6216,88 +6057,33 @@
           <w:rtl/>
         </w:rPr>
       </w:pPr>
-      <w:r>
-        <w:rPr>
-          <w:rFonts w:ascii="Segoe UI" w:hAnsi="Segoe UI" w:cs="Segoe UI"/>
-          <w:noProof/>
-          <w:sz w:val="18"/>
-          <w:szCs w:val="18"/>
-          <w:rtl/>
-        </w:rPr>
-        <w:drawing>
-          <wp:inline distT="0" distB="0" distL="0" distR="0" wp14:anchorId="765DF8DF" wp14:editId="5D66BEAD">
-            <wp:extent cx="2700000" cy="2295569"/>
-            <wp:effectExtent l="190500" t="190500" r="196215" b="180975"/>
-            <wp:docPr id="1745028726" name="Picture 1"/>
-            <wp:cNvGraphicFramePr>
-              <a:graphicFrameLocks xmlns:a="http://schemas.openxmlformats.org/drawingml/2006/main" noChangeAspect="1"/>
-            </wp:cNvGraphicFramePr>
-            <a:graphic xmlns:a="http://schemas.openxmlformats.org/drawingml/2006/main">
-              <a:graphicData uri="http://schemas.openxmlformats.org/drawingml/2006/picture">
-                <pic:pic xmlns:pic="http://schemas.openxmlformats.org/drawingml/2006/picture">
-                  <pic:nvPicPr>
-                    <pic:cNvPr id="1745028726" name=""/>
-                    <pic:cNvPicPr/>
-                  </pic:nvPicPr>
-                  <pic:blipFill>
-                    <a:blip r:embed="rId19"/>
-                    <a:stretch>
-                      <a:fillRect/>
-                    </a:stretch>
-                  </pic:blipFill>
-                  <pic:spPr>
-                    <a:xfrm>
-                      <a:off x="0" y="0"/>
-                      <a:ext cx="2700000" cy="2295569"/>
-                    </a:xfrm>
-                    <a:prstGeom prst="rect">
-                      <a:avLst/>
-                    </a:prstGeom>
-                    <a:ln>
-                      <a:noFill/>
-                    </a:ln>
-                    <a:effectLst>
-                      <a:outerShdw blurRad="190500" algn="tl" rotWithShape="0">
-                        <a:srgbClr val="000000">
-                          <a:alpha val="70000"/>
-                        </a:srgbClr>
-                      </a:outerShdw>
-                    </a:effectLst>
-                  </pic:spPr>
-                </pic:pic>
-              </a:graphicData>
-            </a:graphic>
-          </wp:inline>
-        </w:drawing>
-      </w:r>
-    </w:p>
-    <w:p>
-      <w:pPr>
-        <w:rPr>
-          <w:rFonts w:ascii="Segoe UI" w:hAnsi="Segoe UI" w:cs="Segoe UI"/>
-          <w:sz w:val="18"/>
-          <w:szCs w:val="18"/>
-          <w:rtl/>
-        </w:rPr>
-      </w:pPr>
-    </w:p>
-    <w:p>
-      <w:pPr>
-        <w:rPr>
-          <w:rFonts w:ascii="Segoe UI" w:hAnsi="Segoe UI" w:cs="Segoe UI"/>
-          <w:sz w:val="18"/>
-          <w:szCs w:val="18"/>
-          <w:rtl/>
-        </w:rPr>
-      </w:pPr>
-      <w:r>
-        <w:rPr>
-          <w:rFonts w:ascii="Segoe UI" w:hAnsi="Segoe UI" w:cs="Segoe UI" w:hint="cs"/>
-          <w:sz w:val="18"/>
-          <w:szCs w:val="18"/>
-          <w:rtl/>
-        </w:rPr>
-        <w:lastRenderedPageBreak/>
+    </w:p>
+    <w:p>
+      <w:pPr>
+        <w:rPr>
+          <w:rFonts w:ascii="Segoe UI" w:hAnsi="Segoe UI" w:cs="Segoe UI"/>
+          <w:sz w:val="18"/>
+          <w:szCs w:val="18"/>
+          <w:rtl/>
+        </w:rPr>
+      </w:pPr>
+    </w:p>
+    <w:p>
+      <w:pPr>
+        <w:rPr>
+          <w:rFonts w:ascii="Segoe UI" w:hAnsi="Segoe UI" w:cs="Segoe UI"/>
+          <w:sz w:val="18"/>
+          <w:szCs w:val="18"/>
+          <w:rtl/>
+        </w:rPr>
+      </w:pPr>
+      <w:r>
+        <w:rPr>
+          <w:rFonts w:ascii="Segoe UI" w:hAnsi="Segoe UI" w:cs="Segoe UI" w:hint="cs"/>
+          <w:sz w:val="18"/>
+          <w:szCs w:val="18"/>
+          <w:rtl/>
+        </w:rPr>
         <w:t>گزينه وسط مربوط به درس ها و گزينه سوم (سمت چپ) مربوط به کلاس ها است:</w:t>
       </w:r>
     </w:p>
@@ -6311,60 +6097,6 @@
           <w:rtl/>
         </w:rPr>
       </w:pPr>
-      <w:r>
-        <w:rPr>
-          <w:rFonts w:ascii="Segoe UI" w:hAnsi="Segoe UI" w:cs="Segoe UI"/>
-          <w:noProof/>
-          <w:sz w:val="18"/>
-          <w:szCs w:val="18"/>
-          <w:rtl/>
-        </w:rPr>
-        <w:drawing>
-          <wp:inline distT="0" distB="0" distL="0" distR="0" wp14:anchorId="340D4540" wp14:editId="7C266FBA">
-            <wp:extent cx="3600000" cy="2005008"/>
-            <wp:effectExtent l="190500" t="190500" r="191135" b="186055"/>
-            <wp:docPr id="1200845090" name="Picture 1"/>
-            <wp:cNvGraphicFramePr>
-              <a:graphicFrameLocks xmlns:a="http://schemas.openxmlformats.org/drawingml/2006/main" noChangeAspect="1"/>
-            </wp:cNvGraphicFramePr>
-            <a:graphic xmlns:a="http://schemas.openxmlformats.org/drawingml/2006/main">
-              <a:graphicData uri="http://schemas.openxmlformats.org/drawingml/2006/picture">
-                <pic:pic xmlns:pic="http://schemas.openxmlformats.org/drawingml/2006/picture">
-                  <pic:nvPicPr>
-                    <pic:cNvPr id="1200845090" name=""/>
-                    <pic:cNvPicPr/>
-                  </pic:nvPicPr>
-                  <pic:blipFill>
-                    <a:blip r:embed="rId20"/>
-                    <a:stretch>
-                      <a:fillRect/>
-                    </a:stretch>
-                  </pic:blipFill>
-                  <pic:spPr>
-                    <a:xfrm>
-                      <a:off x="0" y="0"/>
-                      <a:ext cx="3600000" cy="2005008"/>
-                    </a:xfrm>
-                    <a:prstGeom prst="rect">
-                      <a:avLst/>
-                    </a:prstGeom>
-                    <a:ln>
-                      <a:noFill/>
-                    </a:ln>
-                    <a:effectLst>
-                      <a:outerShdw blurRad="190500" algn="tl" rotWithShape="0">
-                        <a:srgbClr val="000000">
-                          <a:alpha val="70000"/>
-                        </a:srgbClr>
-                      </a:outerShdw>
-                    </a:effectLst>
-                  </pic:spPr>
-                </pic:pic>
-              </a:graphicData>
-            </a:graphic>
-          </wp:inline>
-        </w:drawing>
-      </w:r>
     </w:p>
     <w:p>
       <w:pPr>
@@ -6395,60 +6127,6 @@
           <w:rtl/>
         </w:rPr>
       </w:pPr>
-      <w:r>
-        <w:rPr>
-          <w:rFonts w:ascii="Segoe UI" w:hAnsi="Segoe UI" w:cs="Segoe UI"/>
-          <w:noProof/>
-          <w:sz w:val="18"/>
-          <w:szCs w:val="18"/>
-          <w:rtl/>
-        </w:rPr>
-        <w:drawing>
-          <wp:inline distT="0" distB="0" distL="0" distR="0" wp14:anchorId="1D773FD8" wp14:editId="7B5AEB88">
-            <wp:extent cx="2880000" cy="1258763"/>
-            <wp:effectExtent l="190500" t="190500" r="187325" b="189230"/>
-            <wp:docPr id="93695654" name="Picture 1"/>
-            <wp:cNvGraphicFramePr>
-              <a:graphicFrameLocks xmlns:a="http://schemas.openxmlformats.org/drawingml/2006/main" noChangeAspect="1"/>
-            </wp:cNvGraphicFramePr>
-            <a:graphic xmlns:a="http://schemas.openxmlformats.org/drawingml/2006/main">
-              <a:graphicData uri="http://schemas.openxmlformats.org/drawingml/2006/picture">
-                <pic:pic xmlns:pic="http://schemas.openxmlformats.org/drawingml/2006/picture">
-                  <pic:nvPicPr>
-                    <pic:cNvPr id="93695654" name=""/>
-                    <pic:cNvPicPr/>
-                  </pic:nvPicPr>
-                  <pic:blipFill>
-                    <a:blip r:embed="rId21"/>
-                    <a:stretch>
-                      <a:fillRect/>
-                    </a:stretch>
-                  </pic:blipFill>
-                  <pic:spPr>
-                    <a:xfrm>
-                      <a:off x="0" y="0"/>
-                      <a:ext cx="2880000" cy="1258763"/>
-                    </a:xfrm>
-                    <a:prstGeom prst="rect">
-                      <a:avLst/>
-                    </a:prstGeom>
-                    <a:ln>
-                      <a:noFill/>
-                    </a:ln>
-                    <a:effectLst>
-                      <a:outerShdw blurRad="190500" algn="tl" rotWithShape="0">
-                        <a:srgbClr val="000000">
-                          <a:alpha val="70000"/>
-                        </a:srgbClr>
-                      </a:outerShdw>
-                    </a:effectLst>
-                  </pic:spPr>
-                </pic:pic>
-              </a:graphicData>
-            </a:graphic>
-          </wp:inline>
-        </w:drawing>
-      </w:r>
     </w:p>
     <w:p>
       <w:pPr>
@@ -6460,60 +6138,6 @@
           <w:rtl/>
         </w:rPr>
       </w:pPr>
-      <w:r>
-        <w:rPr>
-          <w:rFonts w:ascii="Segoe UI" w:hAnsi="Segoe UI" w:cs="Segoe UI"/>
-          <w:noProof/>
-          <w:sz w:val="18"/>
-          <w:szCs w:val="18"/>
-          <w:rtl/>
-        </w:rPr>
-        <w:drawing>
-          <wp:inline distT="0" distB="0" distL="0" distR="0" wp14:anchorId="7C92566E" wp14:editId="48BDD640">
-            <wp:extent cx="2880000" cy="1596349"/>
-            <wp:effectExtent l="190500" t="190500" r="187325" b="194945"/>
-            <wp:docPr id="333963789" name="Picture 1"/>
-            <wp:cNvGraphicFramePr>
-              <a:graphicFrameLocks xmlns:a="http://schemas.openxmlformats.org/drawingml/2006/main" noChangeAspect="1"/>
-            </wp:cNvGraphicFramePr>
-            <a:graphic xmlns:a="http://schemas.openxmlformats.org/drawingml/2006/main">
-              <a:graphicData uri="http://schemas.openxmlformats.org/drawingml/2006/picture">
-                <pic:pic xmlns:pic="http://schemas.openxmlformats.org/drawingml/2006/picture">
-                  <pic:nvPicPr>
-                    <pic:cNvPr id="333963789" name=""/>
-                    <pic:cNvPicPr/>
-                  </pic:nvPicPr>
-                  <pic:blipFill>
-                    <a:blip r:embed="rId22"/>
-                    <a:stretch>
-                      <a:fillRect/>
-                    </a:stretch>
-                  </pic:blipFill>
-                  <pic:spPr>
-                    <a:xfrm>
-                      <a:off x="0" y="0"/>
-                      <a:ext cx="2880000" cy="1596349"/>
-                    </a:xfrm>
-                    <a:prstGeom prst="rect">
-                      <a:avLst/>
-                    </a:prstGeom>
-                    <a:ln>
-                      <a:noFill/>
-                    </a:ln>
-                    <a:effectLst>
-                      <a:outerShdw blurRad="190500" algn="tl" rotWithShape="0">
-                        <a:srgbClr val="000000">
-                          <a:alpha val="70000"/>
-                        </a:srgbClr>
-                      </a:outerShdw>
-                    </a:effectLst>
-                  </pic:spPr>
-                </pic:pic>
-              </a:graphicData>
-            </a:graphic>
-          </wp:inline>
-        </w:drawing>
-      </w:r>
     </w:p>
     <w:p>
       <w:pPr>
@@ -6525,61 +6149,6 @@
           <w:rtl/>
         </w:rPr>
       </w:pPr>
-      <w:r>
-        <w:rPr>
-          <w:rFonts w:ascii="Segoe UI" w:hAnsi="Segoe UI" w:cs="Segoe UI"/>
-          <w:noProof/>
-          <w:sz w:val="18"/>
-          <w:szCs w:val="18"/>
-          <w:rtl/>
-        </w:rPr>
-        <w:lastRenderedPageBreak/>
-        <w:drawing>
-          <wp:inline distT="0" distB="0" distL="0" distR="0" wp14:anchorId="109B9080" wp14:editId="10EEE3C2">
-            <wp:extent cx="2520000" cy="2286594"/>
-            <wp:effectExtent l="190500" t="190500" r="185420" b="190500"/>
-            <wp:docPr id="550938327" name="Picture 1"/>
-            <wp:cNvGraphicFramePr>
-              <a:graphicFrameLocks xmlns:a="http://schemas.openxmlformats.org/drawingml/2006/main" noChangeAspect="1"/>
-            </wp:cNvGraphicFramePr>
-            <a:graphic xmlns:a="http://schemas.openxmlformats.org/drawingml/2006/main">
-              <a:graphicData uri="http://schemas.openxmlformats.org/drawingml/2006/picture">
-                <pic:pic xmlns:pic="http://schemas.openxmlformats.org/drawingml/2006/picture">
-                  <pic:nvPicPr>
-                    <pic:cNvPr id="550938327" name=""/>
-                    <pic:cNvPicPr/>
-                  </pic:nvPicPr>
-                  <pic:blipFill>
-                    <a:blip r:embed="rId23"/>
-                    <a:stretch>
-                      <a:fillRect/>
-                    </a:stretch>
-                  </pic:blipFill>
-                  <pic:spPr>
-                    <a:xfrm>
-                      <a:off x="0" y="0"/>
-                      <a:ext cx="2520000" cy="2286594"/>
-                    </a:xfrm>
-                    <a:prstGeom prst="rect">
-                      <a:avLst/>
-                    </a:prstGeom>
-                    <a:ln>
-                      <a:noFill/>
-                    </a:ln>
-                    <a:effectLst>
-                      <a:outerShdw blurRad="190500" algn="tl" rotWithShape="0">
-                        <a:srgbClr val="000000">
-                          <a:alpha val="70000"/>
-                        </a:srgbClr>
-                      </a:outerShdw>
-                    </a:effectLst>
-                  </pic:spPr>
-                </pic:pic>
-              </a:graphicData>
-            </a:graphic>
-          </wp:inline>
-        </w:drawing>
-      </w:r>
     </w:p>
     <w:tbl>
       <w:tblPr>
@@ -6622,16 +6191,7 @@
                 <w:szCs w:val="18"/>
                 <w:rtl/>
               </w:rPr>
-              <w:t>راهنماي آيکون ها:</w:t>
-            </w:r>
-            <w:r>
-              <w:rPr>
-                <w:rFonts w:ascii="Segoe UI" w:hAnsi="Segoe UI" w:cs="Segoe UI" w:hint="cs"/>
-                <w:sz w:val="18"/>
-                <w:szCs w:val="18"/>
-                <w:rtl/>
-              </w:rPr>
-              <w:t xml:space="preserve"> </w:t>
+              <w:t xml:space="preserve">راهنماي آيکون ها: </w:t>
             </w:r>
           </w:p>
         </w:tc>
@@ -6673,7 +6233,7 @@
                           <pic:cNvPicPr/>
                         </pic:nvPicPr>
                         <pic:blipFill>
-                          <a:blip r:embed="rId24"/>
+                          <a:blip r:embed="rId16"/>
                           <a:stretch>
                             <a:fillRect/>
                           </a:stretch>
@@ -6889,8 +6449,8 @@
         <w:tblLook w:val="04A0" w:firstRow="1" w:lastRow="0" w:firstColumn="1" w:lastColumn="0" w:noHBand="0" w:noVBand="1"/>
       </w:tblPr>
       <w:tblGrid>
-        <w:gridCol w:w="4513"/>
-        <w:gridCol w:w="4513"/>
+        <w:gridCol w:w="4508"/>
+        <w:gridCol w:w="4508"/>
       </w:tblGrid>
       <w:tr>
         <w:tc>
@@ -6906,60 +6466,6 @@
                 <w:rtl/>
               </w:rPr>
             </w:pPr>
-            <w:r>
-              <w:rPr>
-                <w:rFonts w:ascii="Segoe UI" w:hAnsi="Segoe UI" w:cs="Segoe UI"/>
-                <w:noProof/>
-                <w:sz w:val="18"/>
-                <w:szCs w:val="18"/>
-                <w:rtl/>
-              </w:rPr>
-              <w:drawing>
-                <wp:inline distT="0" distB="0" distL="0" distR="0" wp14:anchorId="3A736312" wp14:editId="201CB2B1">
-                  <wp:extent cx="2520000" cy="923293"/>
-                  <wp:effectExtent l="190500" t="190500" r="185420" b="181610"/>
-                  <wp:docPr id="1517361771" name="Picture 1"/>
-                  <wp:cNvGraphicFramePr>
-                    <a:graphicFrameLocks xmlns:a="http://schemas.openxmlformats.org/drawingml/2006/main" noChangeAspect="1"/>
-                  </wp:cNvGraphicFramePr>
-                  <a:graphic xmlns:a="http://schemas.openxmlformats.org/drawingml/2006/main">
-                    <a:graphicData uri="http://schemas.openxmlformats.org/drawingml/2006/picture">
-                      <pic:pic xmlns:pic="http://schemas.openxmlformats.org/drawingml/2006/picture">
-                        <pic:nvPicPr>
-                          <pic:cNvPr id="1517361771" name=""/>
-                          <pic:cNvPicPr/>
-                        </pic:nvPicPr>
-                        <pic:blipFill>
-                          <a:blip r:embed="rId25"/>
-                          <a:stretch>
-                            <a:fillRect/>
-                          </a:stretch>
-                        </pic:blipFill>
-                        <pic:spPr>
-                          <a:xfrm>
-                            <a:off x="0" y="0"/>
-                            <a:ext cx="2520000" cy="923293"/>
-                          </a:xfrm>
-                          <a:prstGeom prst="rect">
-                            <a:avLst/>
-                          </a:prstGeom>
-                          <a:ln>
-                            <a:noFill/>
-                          </a:ln>
-                          <a:effectLst>
-                            <a:outerShdw blurRad="190500" algn="tl" rotWithShape="0">
-                              <a:srgbClr val="000000">
-                                <a:alpha val="70000"/>
-                              </a:srgbClr>
-                            </a:outerShdw>
-                          </a:effectLst>
-                        </pic:spPr>
-                      </pic:pic>
-                    </a:graphicData>
-                  </a:graphic>
-                </wp:inline>
-              </w:drawing>
-            </w:r>
           </w:p>
         </w:tc>
         <w:tc>
@@ -6975,60 +6481,6 @@
                 <w:rtl/>
               </w:rPr>
             </w:pPr>
-            <w:r>
-              <w:rPr>
-                <w:rFonts w:ascii="Segoe UI" w:hAnsi="Segoe UI" w:cs="Segoe UI"/>
-                <w:noProof/>
-                <w:sz w:val="18"/>
-                <w:szCs w:val="18"/>
-                <w:rtl/>
-              </w:rPr>
-              <w:drawing>
-                <wp:inline distT="0" distB="0" distL="0" distR="0" wp14:anchorId="2F1C454C" wp14:editId="6A9B477A">
-                  <wp:extent cx="2520000" cy="655267"/>
-                  <wp:effectExtent l="190500" t="190500" r="185420" b="183515"/>
-                  <wp:docPr id="1545228149" name="Picture 1"/>
-                  <wp:cNvGraphicFramePr>
-                    <a:graphicFrameLocks xmlns:a="http://schemas.openxmlformats.org/drawingml/2006/main" noChangeAspect="1"/>
-                  </wp:cNvGraphicFramePr>
-                  <a:graphic xmlns:a="http://schemas.openxmlformats.org/drawingml/2006/main">
-                    <a:graphicData uri="http://schemas.openxmlformats.org/drawingml/2006/picture">
-                      <pic:pic xmlns:pic="http://schemas.openxmlformats.org/drawingml/2006/picture">
-                        <pic:nvPicPr>
-                          <pic:cNvPr id="1545228149" name=""/>
-                          <pic:cNvPicPr/>
-                        </pic:nvPicPr>
-                        <pic:blipFill>
-                          <a:blip r:embed="rId26"/>
-                          <a:stretch>
-                            <a:fillRect/>
-                          </a:stretch>
-                        </pic:blipFill>
-                        <pic:spPr>
-                          <a:xfrm>
-                            <a:off x="0" y="0"/>
-                            <a:ext cx="2520000" cy="655267"/>
-                          </a:xfrm>
-                          <a:prstGeom prst="rect">
-                            <a:avLst/>
-                          </a:prstGeom>
-                          <a:ln>
-                            <a:noFill/>
-                          </a:ln>
-                          <a:effectLst>
-                            <a:outerShdw blurRad="190500" algn="tl" rotWithShape="0">
-                              <a:srgbClr val="000000">
-                                <a:alpha val="70000"/>
-                              </a:srgbClr>
-                            </a:outerShdw>
-                          </a:effectLst>
-                        </pic:spPr>
-                      </pic:pic>
-                    </a:graphicData>
-                  </a:graphic>
-                </wp:inline>
-              </w:drawing>
-            </w:r>
           </w:p>
         </w:tc>
       </w:tr>
@@ -7092,60 +6544,6 @@
           <w:rtl/>
         </w:rPr>
       </w:pPr>
-      <w:r>
-        <w:rPr>
-          <w:rFonts w:ascii="Segoe UI" w:hAnsi="Segoe UI" w:cs="Segoe UI"/>
-          <w:noProof/>
-          <w:sz w:val="18"/>
-          <w:szCs w:val="18"/>
-          <w:rtl/>
-        </w:rPr>
-        <w:drawing>
-          <wp:inline distT="0" distB="0" distL="0" distR="0" wp14:anchorId="69561C22" wp14:editId="330F2B00">
-            <wp:extent cx="2335254" cy="1818838"/>
-            <wp:effectExtent l="190500" t="190500" r="198755" b="181610"/>
-            <wp:docPr id="242648326" name="Picture 1"/>
-            <wp:cNvGraphicFramePr>
-              <a:graphicFrameLocks xmlns:a="http://schemas.openxmlformats.org/drawingml/2006/main" noChangeAspect="1"/>
-            </wp:cNvGraphicFramePr>
-            <a:graphic xmlns:a="http://schemas.openxmlformats.org/drawingml/2006/main">
-              <a:graphicData uri="http://schemas.openxmlformats.org/drawingml/2006/picture">
-                <pic:pic xmlns:pic="http://schemas.openxmlformats.org/drawingml/2006/picture">
-                  <pic:nvPicPr>
-                    <pic:cNvPr id="242648326" name=""/>
-                    <pic:cNvPicPr/>
-                  </pic:nvPicPr>
-                  <pic:blipFill>
-                    <a:blip r:embed="rId27"/>
-                    <a:stretch>
-                      <a:fillRect/>
-                    </a:stretch>
-                  </pic:blipFill>
-                  <pic:spPr>
-                    <a:xfrm>
-                      <a:off x="0" y="0"/>
-                      <a:ext cx="2358749" cy="1837137"/>
-                    </a:xfrm>
-                    <a:prstGeom prst="rect">
-                      <a:avLst/>
-                    </a:prstGeom>
-                    <a:ln>
-                      <a:noFill/>
-                    </a:ln>
-                    <a:effectLst>
-                      <a:outerShdw blurRad="190500" algn="tl" rotWithShape="0">
-                        <a:srgbClr val="000000">
-                          <a:alpha val="70000"/>
-                        </a:srgbClr>
-                      </a:outerShdw>
-                    </a:effectLst>
-                  </pic:spPr>
-                </pic:pic>
-              </a:graphicData>
-            </a:graphic>
-          </wp:inline>
-        </w:drawing>
-      </w:r>
     </w:p>
     <w:p>
       <w:pPr>
@@ -7157,61 +6555,6 @@
           <w:rtl/>
         </w:rPr>
       </w:pPr>
-      <w:r>
-        <w:rPr>
-          <w:rFonts w:ascii="Segoe UI" w:hAnsi="Segoe UI" w:cs="Segoe UI"/>
-          <w:noProof/>
-          <w:sz w:val="18"/>
-          <w:szCs w:val="18"/>
-          <w:rtl/>
-        </w:rPr>
-        <w:lastRenderedPageBreak/>
-        <w:drawing>
-          <wp:inline distT="0" distB="0" distL="0" distR="0" wp14:anchorId="74A2D101" wp14:editId="25391B96">
-            <wp:extent cx="2711726" cy="3792085"/>
-            <wp:effectExtent l="190500" t="190500" r="184150" b="189865"/>
-            <wp:docPr id="1149723101" name="Picture 1"/>
-            <wp:cNvGraphicFramePr>
-              <a:graphicFrameLocks xmlns:a="http://schemas.openxmlformats.org/drawingml/2006/main" noChangeAspect="1"/>
-            </wp:cNvGraphicFramePr>
-            <a:graphic xmlns:a="http://schemas.openxmlformats.org/drawingml/2006/main">
-              <a:graphicData uri="http://schemas.openxmlformats.org/drawingml/2006/picture">
-                <pic:pic xmlns:pic="http://schemas.openxmlformats.org/drawingml/2006/picture">
-                  <pic:nvPicPr>
-                    <pic:cNvPr id="1149723101" name=""/>
-                    <pic:cNvPicPr/>
-                  </pic:nvPicPr>
-                  <pic:blipFill>
-                    <a:blip r:embed="rId28"/>
-                    <a:stretch>
-                      <a:fillRect/>
-                    </a:stretch>
-                  </pic:blipFill>
-                  <pic:spPr>
-                    <a:xfrm>
-                      <a:off x="0" y="0"/>
-                      <a:ext cx="2721017" cy="3805078"/>
-                    </a:xfrm>
-                    <a:prstGeom prst="rect">
-                      <a:avLst/>
-                    </a:prstGeom>
-                    <a:ln>
-                      <a:noFill/>
-                    </a:ln>
-                    <a:effectLst>
-                      <a:outerShdw blurRad="190500" algn="tl" rotWithShape="0">
-                        <a:srgbClr val="000000">
-                          <a:alpha val="70000"/>
-                        </a:srgbClr>
-                      </a:outerShdw>
-                    </a:effectLst>
-                  </pic:spPr>
-                </pic:pic>
-              </a:graphicData>
-            </a:graphic>
-          </wp:inline>
-        </w:drawing>
-      </w:r>
     </w:p>
     <w:p>
       <w:pPr>
@@ -7242,118 +6585,63 @@
           <w:rtl/>
         </w:rPr>
       </w:pPr>
-      <w:r>
-        <w:rPr>
-          <w:rFonts w:ascii="Segoe UI" w:hAnsi="Segoe UI" w:cs="Segoe UI"/>
-          <w:noProof/>
-          <w:sz w:val="18"/>
-          <w:szCs w:val="18"/>
-          <w:rtl/>
-        </w:rPr>
-        <w:drawing>
-          <wp:inline distT="0" distB="0" distL="0" distR="0" wp14:anchorId="1021BC3E" wp14:editId="793F5EFA">
-            <wp:extent cx="3600000" cy="2794327"/>
-            <wp:effectExtent l="190500" t="190500" r="191135" b="196850"/>
-            <wp:docPr id="1698114953" name="Picture 1"/>
-            <wp:cNvGraphicFramePr>
-              <a:graphicFrameLocks xmlns:a="http://schemas.openxmlformats.org/drawingml/2006/main" noChangeAspect="1"/>
-            </wp:cNvGraphicFramePr>
-            <a:graphic xmlns:a="http://schemas.openxmlformats.org/drawingml/2006/main">
-              <a:graphicData uri="http://schemas.openxmlformats.org/drawingml/2006/picture">
-                <pic:pic xmlns:pic="http://schemas.openxmlformats.org/drawingml/2006/picture">
-                  <pic:nvPicPr>
-                    <pic:cNvPr id="1698114953" name=""/>
-                    <pic:cNvPicPr/>
-                  </pic:nvPicPr>
-                  <pic:blipFill>
-                    <a:blip r:embed="rId29"/>
-                    <a:stretch>
-                      <a:fillRect/>
-                    </a:stretch>
-                  </pic:blipFill>
-                  <pic:spPr>
-                    <a:xfrm>
-                      <a:off x="0" y="0"/>
-                      <a:ext cx="3600000" cy="2794327"/>
-                    </a:xfrm>
-                    <a:prstGeom prst="rect">
-                      <a:avLst/>
-                    </a:prstGeom>
-                    <a:ln>
-                      <a:noFill/>
-                    </a:ln>
-                    <a:effectLst>
-                      <a:outerShdw blurRad="190500" algn="tl" rotWithShape="0">
-                        <a:srgbClr val="000000">
-                          <a:alpha val="70000"/>
-                        </a:srgbClr>
-                      </a:outerShdw>
-                    </a:effectLst>
-                  </pic:spPr>
-                </pic:pic>
-              </a:graphicData>
-            </a:graphic>
-          </wp:inline>
-        </w:drawing>
-      </w:r>
-    </w:p>
-    <w:p>
-      <w:pPr>
-        <w:rPr>
-          <w:rFonts w:ascii="Segoe UI" w:hAnsi="Segoe UI" w:cs="Segoe UI"/>
-          <w:sz w:val="18"/>
-          <w:szCs w:val="18"/>
-          <w:rtl/>
-        </w:rPr>
-      </w:pPr>
-    </w:p>
-    <w:p>
-      <w:pPr>
-        <w:rPr>
-          <w:rFonts w:ascii="Segoe UI" w:hAnsi="Segoe UI" w:cs="Segoe UI"/>
-          <w:sz w:val="18"/>
-          <w:szCs w:val="18"/>
-          <w:rtl/>
-        </w:rPr>
-      </w:pPr>
-    </w:p>
-    <w:p>
-      <w:pPr>
-        <w:rPr>
-          <w:rFonts w:ascii="Segoe UI" w:hAnsi="Segoe UI" w:cs="Segoe UI"/>
-          <w:sz w:val="18"/>
-          <w:szCs w:val="18"/>
-          <w:rtl/>
-        </w:rPr>
-      </w:pPr>
-    </w:p>
-    <w:p>
-      <w:pPr>
-        <w:rPr>
-          <w:rFonts w:ascii="Segoe UI" w:hAnsi="Segoe UI" w:cs="Segoe UI"/>
-          <w:sz w:val="18"/>
-          <w:szCs w:val="18"/>
-          <w:rtl/>
-        </w:rPr>
-      </w:pPr>
-    </w:p>
-    <w:p>
-      <w:pPr>
-        <w:rPr>
-          <w:rFonts w:ascii="Segoe UI" w:hAnsi="Segoe UI" w:cs="Segoe UI"/>
-          <w:sz w:val="18"/>
-          <w:szCs w:val="18"/>
-          <w:rtl/>
-        </w:rPr>
-      </w:pPr>
-      <w:r>
-        <w:rPr>
-          <w:rFonts w:ascii="Segoe UI" w:hAnsi="Segoe UI" w:cs="Segoe UI" w:hint="cs"/>
-          <w:sz w:val="18"/>
-          <w:szCs w:val="18"/>
-          <w:rtl/>
-        </w:rPr>
-        <w:lastRenderedPageBreak/>
+    </w:p>
+    <w:p>
+      <w:pPr>
+        <w:rPr>
+          <w:rFonts w:ascii="Segoe UI" w:hAnsi="Segoe UI" w:cs="Segoe UI"/>
+          <w:sz w:val="18"/>
+          <w:szCs w:val="18"/>
+          <w:rtl/>
+        </w:rPr>
+      </w:pPr>
+    </w:p>
+    <w:p>
+      <w:pPr>
+        <w:rPr>
+          <w:rFonts w:ascii="Segoe UI" w:hAnsi="Segoe UI" w:cs="Segoe UI"/>
+          <w:sz w:val="18"/>
+          <w:szCs w:val="18"/>
+          <w:rtl/>
+        </w:rPr>
+      </w:pPr>
+    </w:p>
+    <w:p>
+      <w:pPr>
+        <w:rPr>
+          <w:rFonts w:ascii="Segoe UI" w:hAnsi="Segoe UI" w:cs="Segoe UI"/>
+          <w:sz w:val="18"/>
+          <w:szCs w:val="18"/>
+          <w:rtl/>
+        </w:rPr>
+      </w:pPr>
+    </w:p>
+    <w:p>
+      <w:pPr>
+        <w:rPr>
+          <w:rFonts w:ascii="Segoe UI" w:hAnsi="Segoe UI" w:cs="Segoe UI"/>
+          <w:sz w:val="18"/>
+          <w:szCs w:val="18"/>
+          <w:rtl/>
+        </w:rPr>
+      </w:pPr>
+    </w:p>
+    <w:p>
+      <w:pPr>
+        <w:rPr>
+          <w:rFonts w:ascii="Segoe UI" w:hAnsi="Segoe UI" w:cs="Segoe UI"/>
+          <w:sz w:val="18"/>
+          <w:szCs w:val="18"/>
+          <w:rtl/>
+        </w:rPr>
+      </w:pPr>
+      <w:r>
+        <w:rPr>
+          <w:rFonts w:ascii="Segoe UI" w:hAnsi="Segoe UI" w:cs="Segoe UI" w:hint="cs"/>
+          <w:sz w:val="18"/>
+          <w:szCs w:val="18"/>
+          <w:rtl/>
+        </w:rPr>
         <w:t>هر تست (سوال) داراي تعدادي گزينه (</w:t>
       </w:r>
       <w:r>
@@ -7384,60 +6672,6 @@
           <w:rtl/>
         </w:rPr>
       </w:pPr>
-      <w:r>
-        <w:rPr>
-          <w:rFonts w:ascii="Segoe UI" w:hAnsi="Segoe UI" w:cs="Segoe UI"/>
-          <w:noProof/>
-          <w:sz w:val="18"/>
-          <w:szCs w:val="18"/>
-          <w:rtl/>
-        </w:rPr>
-        <w:drawing>
-          <wp:inline distT="0" distB="0" distL="0" distR="0" wp14:anchorId="0F2B8F77" wp14:editId="38A77608">
-            <wp:extent cx="3096000" cy="4440253"/>
-            <wp:effectExtent l="190500" t="190500" r="200025" b="189230"/>
-            <wp:docPr id="852693228" name="Picture 1"/>
-            <wp:cNvGraphicFramePr>
-              <a:graphicFrameLocks xmlns:a="http://schemas.openxmlformats.org/drawingml/2006/main" noChangeAspect="1"/>
-            </wp:cNvGraphicFramePr>
-            <a:graphic xmlns:a="http://schemas.openxmlformats.org/drawingml/2006/main">
-              <a:graphicData uri="http://schemas.openxmlformats.org/drawingml/2006/picture">
-                <pic:pic xmlns:pic="http://schemas.openxmlformats.org/drawingml/2006/picture">
-                  <pic:nvPicPr>
-                    <pic:cNvPr id="852693228" name=""/>
-                    <pic:cNvPicPr/>
-                  </pic:nvPicPr>
-                  <pic:blipFill>
-                    <a:blip r:embed="rId30"/>
-                    <a:stretch>
-                      <a:fillRect/>
-                    </a:stretch>
-                  </pic:blipFill>
-                  <pic:spPr>
-                    <a:xfrm>
-                      <a:off x="0" y="0"/>
-                      <a:ext cx="3096000" cy="4440253"/>
-                    </a:xfrm>
-                    <a:prstGeom prst="rect">
-                      <a:avLst/>
-                    </a:prstGeom>
-                    <a:ln>
-                      <a:noFill/>
-                    </a:ln>
-                    <a:effectLst>
-                      <a:outerShdw blurRad="190500" algn="tl" rotWithShape="0">
-                        <a:srgbClr val="000000">
-                          <a:alpha val="70000"/>
-                        </a:srgbClr>
-                      </a:outerShdw>
-                    </a:effectLst>
-                  </pic:spPr>
-                </pic:pic>
-              </a:graphicData>
-            </a:graphic>
-          </wp:inline>
-        </w:drawing>
-      </w:r>
     </w:p>
     <w:p>
       <w:pPr>
@@ -7782,7 +7016,7 @@
                     <pic:cNvPicPr/>
                   </pic:nvPicPr>
                   <pic:blipFill>
-                    <a:blip r:embed="rId24"/>
+                    <a:blip r:embed="rId16"/>
                     <a:stretch>
                       <a:fillRect/>
                     </a:stretch>
@@ -7832,60 +7066,6 @@
           <w:rtl/>
         </w:rPr>
       </w:pPr>
-      <w:r>
-        <w:rPr>
-          <w:rFonts w:ascii="Segoe UI" w:hAnsi="Segoe UI" w:cs="Segoe UI"/>
-          <w:noProof/>
-          <w:sz w:val="18"/>
-          <w:szCs w:val="18"/>
-          <w:rtl/>
-        </w:rPr>
-        <w:drawing>
-          <wp:inline distT="0" distB="0" distL="0" distR="0" wp14:anchorId="51258426" wp14:editId="5786F4E4">
-            <wp:extent cx="2880000" cy="1007968"/>
-            <wp:effectExtent l="190500" t="190500" r="187325" b="192405"/>
-            <wp:docPr id="886144439" name="Picture 1"/>
-            <wp:cNvGraphicFramePr>
-              <a:graphicFrameLocks xmlns:a="http://schemas.openxmlformats.org/drawingml/2006/main" noChangeAspect="1"/>
-            </wp:cNvGraphicFramePr>
-            <a:graphic xmlns:a="http://schemas.openxmlformats.org/drawingml/2006/main">
-              <a:graphicData uri="http://schemas.openxmlformats.org/drawingml/2006/picture">
-                <pic:pic xmlns:pic="http://schemas.openxmlformats.org/drawingml/2006/picture">
-                  <pic:nvPicPr>
-                    <pic:cNvPr id="886144439" name=""/>
-                    <pic:cNvPicPr/>
-                  </pic:nvPicPr>
-                  <pic:blipFill>
-                    <a:blip r:embed="rId31"/>
-                    <a:stretch>
-                      <a:fillRect/>
-                    </a:stretch>
-                  </pic:blipFill>
-                  <pic:spPr>
-                    <a:xfrm>
-                      <a:off x="0" y="0"/>
-                      <a:ext cx="2880000" cy="1007968"/>
-                    </a:xfrm>
-                    <a:prstGeom prst="rect">
-                      <a:avLst/>
-                    </a:prstGeom>
-                    <a:ln>
-                      <a:noFill/>
-                    </a:ln>
-                    <a:effectLst>
-                      <a:outerShdw blurRad="190500" algn="tl" rotWithShape="0">
-                        <a:srgbClr val="000000">
-                          <a:alpha val="70000"/>
-                        </a:srgbClr>
-                      </a:outerShdw>
-                    </a:effectLst>
-                  </pic:spPr>
-                </pic:pic>
-              </a:graphicData>
-            </a:graphic>
-          </wp:inline>
-        </w:drawing>
-      </w:r>
     </w:p>
     <w:p>
       <w:pPr>
@@ -7897,61 +7077,6 @@
           <w:rtl/>
         </w:rPr>
       </w:pPr>
-      <w:r>
-        <w:rPr>
-          <w:rFonts w:ascii="Segoe UI" w:hAnsi="Segoe UI" w:cs="Segoe UI"/>
-          <w:noProof/>
-          <w:sz w:val="18"/>
-          <w:szCs w:val="18"/>
-          <w:rtl/>
-        </w:rPr>
-        <w:lastRenderedPageBreak/>
-        <w:drawing>
-          <wp:inline distT="0" distB="0" distL="0" distR="0" wp14:anchorId="0EC858BA" wp14:editId="77093A48">
-            <wp:extent cx="2880000" cy="1616770"/>
-            <wp:effectExtent l="190500" t="190500" r="187325" b="193040"/>
-            <wp:docPr id="105426460" name="Picture 1"/>
-            <wp:cNvGraphicFramePr>
-              <a:graphicFrameLocks xmlns:a="http://schemas.openxmlformats.org/drawingml/2006/main" noChangeAspect="1"/>
-            </wp:cNvGraphicFramePr>
-            <a:graphic xmlns:a="http://schemas.openxmlformats.org/drawingml/2006/main">
-              <a:graphicData uri="http://schemas.openxmlformats.org/drawingml/2006/picture">
-                <pic:pic xmlns:pic="http://schemas.openxmlformats.org/drawingml/2006/picture">
-                  <pic:nvPicPr>
-                    <pic:cNvPr id="105426460" name=""/>
-                    <pic:cNvPicPr/>
-                  </pic:nvPicPr>
-                  <pic:blipFill>
-                    <a:blip r:embed="rId32"/>
-                    <a:stretch>
-                      <a:fillRect/>
-                    </a:stretch>
-                  </pic:blipFill>
-                  <pic:spPr>
-                    <a:xfrm>
-                      <a:off x="0" y="0"/>
-                      <a:ext cx="2880000" cy="1616770"/>
-                    </a:xfrm>
-                    <a:prstGeom prst="rect">
-                      <a:avLst/>
-                    </a:prstGeom>
-                    <a:ln>
-                      <a:noFill/>
-                    </a:ln>
-                    <a:effectLst>
-                      <a:outerShdw blurRad="190500" algn="tl" rotWithShape="0">
-                        <a:srgbClr val="000000">
-                          <a:alpha val="70000"/>
-                        </a:srgbClr>
-                      </a:outerShdw>
-                    </a:effectLst>
-                  </pic:spPr>
-                </pic:pic>
-              </a:graphicData>
-            </a:graphic>
-          </wp:inline>
-        </w:drawing>
-      </w:r>
     </w:p>
     <w:p>
       <w:pPr>
@@ -8005,7 +7130,7 @@
                     <pic:cNvPicPr/>
                   </pic:nvPicPr>
                   <pic:blipFill>
-                    <a:blip r:embed="rId33"/>
+                    <a:blip r:embed="rId17"/>
                     <a:stretch>
                       <a:fillRect/>
                     </a:stretch>
@@ -8414,61 +7539,6 @@
           <w:rtl/>
         </w:rPr>
       </w:pPr>
-      <w:r>
-        <w:rPr>
-          <w:rFonts w:ascii="Segoe UI" w:hAnsi="Segoe UI" w:cs="Segoe UI"/>
-          <w:noProof/>
-          <w:sz w:val="18"/>
-          <w:szCs w:val="18"/>
-          <w:rtl/>
-        </w:rPr>
-        <w:lastRenderedPageBreak/>
-        <w:drawing>
-          <wp:inline distT="0" distB="0" distL="0" distR="0" wp14:anchorId="7FD658F8" wp14:editId="4E51DED7">
-            <wp:extent cx="2880000" cy="3340109"/>
-            <wp:effectExtent l="190500" t="190500" r="187325" b="184150"/>
-            <wp:docPr id="413594753" name="Picture 1"/>
-            <wp:cNvGraphicFramePr>
-              <a:graphicFrameLocks xmlns:a="http://schemas.openxmlformats.org/drawingml/2006/main" noChangeAspect="1"/>
-            </wp:cNvGraphicFramePr>
-            <a:graphic xmlns:a="http://schemas.openxmlformats.org/drawingml/2006/main">
-              <a:graphicData uri="http://schemas.openxmlformats.org/drawingml/2006/picture">
-                <pic:pic xmlns:pic="http://schemas.openxmlformats.org/drawingml/2006/picture">
-                  <pic:nvPicPr>
-                    <pic:cNvPr id="413594753" name=""/>
-                    <pic:cNvPicPr/>
-                  </pic:nvPicPr>
-                  <pic:blipFill>
-                    <a:blip r:embed="rId34"/>
-                    <a:stretch>
-                      <a:fillRect/>
-                    </a:stretch>
-                  </pic:blipFill>
-                  <pic:spPr>
-                    <a:xfrm>
-                      <a:off x="0" y="0"/>
-                      <a:ext cx="2880000" cy="3340109"/>
-                    </a:xfrm>
-                    <a:prstGeom prst="rect">
-                      <a:avLst/>
-                    </a:prstGeom>
-                    <a:ln>
-                      <a:noFill/>
-                    </a:ln>
-                    <a:effectLst>
-                      <a:outerShdw blurRad="190500" algn="tl" rotWithShape="0">
-                        <a:srgbClr val="000000">
-                          <a:alpha val="70000"/>
-                        </a:srgbClr>
-                      </a:outerShdw>
-                    </a:effectLst>
-                  </pic:spPr>
-                </pic:pic>
-              </a:graphicData>
-            </a:graphic>
-          </wp:inline>
-        </w:drawing>
-      </w:r>
     </w:p>
     <w:p>
       <w:pPr>
@@ -8491,6 +7561,7 @@
           <w:szCs w:val="18"/>
           <w:rtl/>
         </w:rPr>
+        <w:lastRenderedPageBreak/>
         <w:t>در بخش (</w:t>
       </w:r>
       <w:r>
@@ -8603,60 +7674,6 @@
           <w:rtl/>
         </w:rPr>
       </w:pPr>
-      <w:r>
-        <w:rPr>
-          <w:rFonts w:ascii="Segoe UI" w:hAnsi="Segoe UI" w:cs="Segoe UI"/>
-          <w:noProof/>
-          <w:sz w:val="18"/>
-          <w:szCs w:val="18"/>
-          <w:rtl/>
-        </w:rPr>
-        <w:drawing>
-          <wp:inline distT="0" distB="0" distL="0" distR="0" wp14:anchorId="352F6B04" wp14:editId="266EB7EF">
-            <wp:extent cx="2700000" cy="3778981"/>
-            <wp:effectExtent l="190500" t="190500" r="196215" b="183515"/>
-            <wp:docPr id="1061682163" name="Picture 1"/>
-            <wp:cNvGraphicFramePr>
-              <a:graphicFrameLocks xmlns:a="http://schemas.openxmlformats.org/drawingml/2006/main" noChangeAspect="1"/>
-            </wp:cNvGraphicFramePr>
-            <a:graphic xmlns:a="http://schemas.openxmlformats.org/drawingml/2006/main">
-              <a:graphicData uri="http://schemas.openxmlformats.org/drawingml/2006/picture">
-                <pic:pic xmlns:pic="http://schemas.openxmlformats.org/drawingml/2006/picture">
-                  <pic:nvPicPr>
-                    <pic:cNvPr id="1061682163" name=""/>
-                    <pic:cNvPicPr/>
-                  </pic:nvPicPr>
-                  <pic:blipFill>
-                    <a:blip r:embed="rId35"/>
-                    <a:stretch>
-                      <a:fillRect/>
-                    </a:stretch>
-                  </pic:blipFill>
-                  <pic:spPr>
-                    <a:xfrm>
-                      <a:off x="0" y="0"/>
-                      <a:ext cx="2700000" cy="3778981"/>
-                    </a:xfrm>
-                    <a:prstGeom prst="rect">
-                      <a:avLst/>
-                    </a:prstGeom>
-                    <a:ln>
-                      <a:noFill/>
-                    </a:ln>
-                    <a:effectLst>
-                      <a:outerShdw blurRad="190500" algn="tl" rotWithShape="0">
-                        <a:srgbClr val="000000">
-                          <a:alpha val="70000"/>
-                        </a:srgbClr>
-                      </a:outerShdw>
-                    </a:effectLst>
-                  </pic:spPr>
-                </pic:pic>
-              </a:graphicData>
-            </a:graphic>
-          </wp:inline>
-        </w:drawing>
-      </w:r>
     </w:p>
     <w:p>
       <w:pPr>
@@ -8693,7 +7710,6 @@
           <w:szCs w:val="18"/>
           <w:rtl/>
         </w:rPr>
-        <w:lastRenderedPageBreak/>
         <w:t>به صفحه نخست برگرديد و وارد بخش دانشجويان شويد. سپس يک کلاس ايجاد کنيد و ذخيره کنيد.</w:t>
       </w:r>
     </w:p>
@@ -8707,60 +7723,6 @@
           <w:rtl/>
         </w:rPr>
       </w:pPr>
-      <w:r>
-        <w:rPr>
-          <w:rFonts w:ascii="Segoe UI" w:hAnsi="Segoe UI" w:cs="Segoe UI"/>
-          <w:noProof/>
-          <w:sz w:val="18"/>
-          <w:szCs w:val="18"/>
-          <w:rtl/>
-        </w:rPr>
-        <w:drawing>
-          <wp:inline distT="0" distB="0" distL="0" distR="0" wp14:anchorId="04139DC8" wp14:editId="717EE03F">
-            <wp:extent cx="2700000" cy="2244415"/>
-            <wp:effectExtent l="190500" t="190500" r="196215" b="194310"/>
-            <wp:docPr id="2017644531" name="Picture 1"/>
-            <wp:cNvGraphicFramePr>
-              <a:graphicFrameLocks xmlns:a="http://schemas.openxmlformats.org/drawingml/2006/main" noChangeAspect="1"/>
-            </wp:cNvGraphicFramePr>
-            <a:graphic xmlns:a="http://schemas.openxmlformats.org/drawingml/2006/main">
-              <a:graphicData uri="http://schemas.openxmlformats.org/drawingml/2006/picture">
-                <pic:pic xmlns:pic="http://schemas.openxmlformats.org/drawingml/2006/picture">
-                  <pic:nvPicPr>
-                    <pic:cNvPr id="2017644531" name=""/>
-                    <pic:cNvPicPr/>
-                  </pic:nvPicPr>
-                  <pic:blipFill>
-                    <a:blip r:embed="rId36"/>
-                    <a:stretch>
-                      <a:fillRect/>
-                    </a:stretch>
-                  </pic:blipFill>
-                  <pic:spPr>
-                    <a:xfrm>
-                      <a:off x="0" y="0"/>
-                      <a:ext cx="2700000" cy="2244415"/>
-                    </a:xfrm>
-                    <a:prstGeom prst="rect">
-                      <a:avLst/>
-                    </a:prstGeom>
-                    <a:ln>
-                      <a:noFill/>
-                    </a:ln>
-                    <a:effectLst>
-                      <a:outerShdw blurRad="190500" algn="tl" rotWithShape="0">
-                        <a:srgbClr val="000000">
-                          <a:alpha val="70000"/>
-                        </a:srgbClr>
-                      </a:outerShdw>
-                    </a:effectLst>
-                  </pic:spPr>
-                </pic:pic>
-              </a:graphicData>
-            </a:graphic>
-          </wp:inline>
-        </w:drawing>
-      </w:r>
     </w:p>
     <w:p>
       <w:pPr>
@@ -8814,7 +7776,7 @@
                     <pic:cNvPicPr/>
                   </pic:nvPicPr>
                   <pic:blipFill>
-                    <a:blip r:embed="rId37"/>
+                    <a:blip r:embed="rId18"/>
                     <a:stretch>
                       <a:fillRect/>
                     </a:stretch>
@@ -9050,78 +8012,23 @@
           <w:rtl/>
         </w:rPr>
       </w:pPr>
-      <w:r>
-        <w:rPr>
-          <w:rFonts w:ascii="Segoe UI" w:hAnsi="Segoe UI" w:cs="Segoe UI"/>
-          <w:noProof/>
-          <w:sz w:val="18"/>
-          <w:szCs w:val="18"/>
-          <w:rtl/>
-        </w:rPr>
-        <w:drawing>
-          <wp:inline distT="0" distB="0" distL="0" distR="0" wp14:anchorId="6A7A0C4E" wp14:editId="27BF522D">
-            <wp:extent cx="2520000" cy="2380683"/>
-            <wp:effectExtent l="190500" t="190500" r="185420" b="191135"/>
-            <wp:docPr id="604205603" name="Picture 1"/>
-            <wp:cNvGraphicFramePr>
-              <a:graphicFrameLocks xmlns:a="http://schemas.openxmlformats.org/drawingml/2006/main" noChangeAspect="1"/>
-            </wp:cNvGraphicFramePr>
-            <a:graphic xmlns:a="http://schemas.openxmlformats.org/drawingml/2006/main">
-              <a:graphicData uri="http://schemas.openxmlformats.org/drawingml/2006/picture">
-                <pic:pic xmlns:pic="http://schemas.openxmlformats.org/drawingml/2006/picture">
-                  <pic:nvPicPr>
-                    <pic:cNvPr id="604205603" name=""/>
-                    <pic:cNvPicPr/>
-                  </pic:nvPicPr>
-                  <pic:blipFill>
-                    <a:blip r:embed="rId38"/>
-                    <a:stretch>
-                      <a:fillRect/>
-                    </a:stretch>
-                  </pic:blipFill>
-                  <pic:spPr>
-                    <a:xfrm>
-                      <a:off x="0" y="0"/>
-                      <a:ext cx="2520000" cy="2380683"/>
-                    </a:xfrm>
-                    <a:prstGeom prst="rect">
-                      <a:avLst/>
-                    </a:prstGeom>
-                    <a:ln>
-                      <a:noFill/>
-                    </a:ln>
-                    <a:effectLst>
-                      <a:outerShdw blurRad="190500" algn="tl" rotWithShape="0">
-                        <a:srgbClr val="000000">
-                          <a:alpha val="70000"/>
-                        </a:srgbClr>
-                      </a:outerShdw>
-                    </a:effectLst>
-                  </pic:spPr>
-                </pic:pic>
-              </a:graphicData>
-            </a:graphic>
-          </wp:inline>
-        </w:drawing>
-      </w:r>
-    </w:p>
-    <w:p>
-      <w:pPr>
-        <w:rPr>
-          <w:rFonts w:ascii="Segoe UI" w:hAnsi="Segoe UI" w:cs="Segoe UI"/>
-          <w:sz w:val="18"/>
-          <w:szCs w:val="18"/>
-          <w:rtl/>
-        </w:rPr>
-      </w:pPr>
-      <w:r>
-        <w:rPr>
-          <w:rFonts w:ascii="Segoe UI" w:hAnsi="Segoe UI" w:cs="Segoe UI" w:hint="cs"/>
-          <w:sz w:val="18"/>
-          <w:szCs w:val="18"/>
-          <w:rtl/>
-        </w:rPr>
-        <w:lastRenderedPageBreak/>
+    </w:p>
+    <w:p>
+      <w:pPr>
+        <w:rPr>
+          <w:rFonts w:ascii="Segoe UI" w:hAnsi="Segoe UI" w:cs="Segoe UI"/>
+          <w:sz w:val="18"/>
+          <w:szCs w:val="18"/>
+          <w:rtl/>
+        </w:rPr>
+      </w:pPr>
+      <w:r>
+        <w:rPr>
+          <w:rFonts w:ascii="Segoe UI" w:hAnsi="Segoe UI" w:cs="Segoe UI" w:hint="cs"/>
+          <w:sz w:val="18"/>
+          <w:szCs w:val="18"/>
+          <w:rtl/>
+        </w:rPr>
         <w:t>در اين حالت مي توانيد:</w:t>
       </w:r>
     </w:p>
@@ -9229,60 +8136,6 @@
           <w:rtl/>
         </w:rPr>
       </w:pPr>
-      <w:r>
-        <w:rPr>
-          <w:rFonts w:ascii="Segoe UI" w:hAnsi="Segoe UI" w:cs="Segoe UI"/>
-          <w:noProof/>
-          <w:sz w:val="18"/>
-          <w:szCs w:val="18"/>
-          <w:rtl/>
-        </w:rPr>
-        <w:drawing>
-          <wp:inline distT="0" distB="0" distL="0" distR="0" wp14:anchorId="412BD261" wp14:editId="6AACB09C">
-            <wp:extent cx="2520000" cy="2627489"/>
-            <wp:effectExtent l="190500" t="190500" r="185420" b="192405"/>
-            <wp:docPr id="1894592742" name="Picture 1"/>
-            <wp:cNvGraphicFramePr>
-              <a:graphicFrameLocks xmlns:a="http://schemas.openxmlformats.org/drawingml/2006/main" noChangeAspect="1"/>
-            </wp:cNvGraphicFramePr>
-            <a:graphic xmlns:a="http://schemas.openxmlformats.org/drawingml/2006/main">
-              <a:graphicData uri="http://schemas.openxmlformats.org/drawingml/2006/picture">
-                <pic:pic xmlns:pic="http://schemas.openxmlformats.org/drawingml/2006/picture">
-                  <pic:nvPicPr>
-                    <pic:cNvPr id="1894592742" name=""/>
-                    <pic:cNvPicPr/>
-                  </pic:nvPicPr>
-                  <pic:blipFill>
-                    <a:blip r:embed="rId39"/>
-                    <a:stretch>
-                      <a:fillRect/>
-                    </a:stretch>
-                  </pic:blipFill>
-                  <pic:spPr>
-                    <a:xfrm>
-                      <a:off x="0" y="0"/>
-                      <a:ext cx="2520000" cy="2627489"/>
-                    </a:xfrm>
-                    <a:prstGeom prst="rect">
-                      <a:avLst/>
-                    </a:prstGeom>
-                    <a:ln>
-                      <a:noFill/>
-                    </a:ln>
-                    <a:effectLst>
-                      <a:outerShdw blurRad="190500" algn="tl" rotWithShape="0">
-                        <a:srgbClr val="000000">
-                          <a:alpha val="70000"/>
-                        </a:srgbClr>
-                      </a:outerShdw>
-                    </a:effectLst>
-                  </pic:spPr>
-                </pic:pic>
-              </a:graphicData>
-            </a:graphic>
-          </wp:inline>
-        </w:drawing>
-      </w:r>
     </w:p>
     <w:p>
       <w:pPr>
@@ -9336,7 +8189,7 @@
                     <pic:cNvPicPr/>
                   </pic:nvPicPr>
                   <pic:blipFill>
-                    <a:blip r:embed="rId40"/>
+                    <a:blip r:embed="rId19"/>
                     <a:stretch>
                       <a:fillRect/>
                     </a:stretch>
@@ -9638,6 +8491,7 @@
           <w:szCs w:val="18"/>
           <w:rtl/>
         </w:rPr>
+        <w:lastRenderedPageBreak/>
         <w:t>فعال / غير فعال بودن اکانت</w:t>
       </w:r>
     </w:p>
@@ -9816,7 +8670,6 @@
           <w:szCs w:val="18"/>
           <w:rtl/>
         </w:rPr>
-        <w:lastRenderedPageBreak/>
         <w:t>به بخش آزمون ها برويد و آيکون مربوط به افزودن دانشجويان به آزمون را کليک کنيد:</w:t>
       </w:r>
     </w:p>
@@ -9830,60 +8683,6 @@
           <w:rtl/>
         </w:rPr>
       </w:pPr>
-      <w:r>
-        <w:rPr>
-          <w:rFonts w:ascii="Segoe UI" w:hAnsi="Segoe UI" w:cs="Segoe UI"/>
-          <w:noProof/>
-          <w:sz w:val="18"/>
-          <w:szCs w:val="18"/>
-          <w:rtl/>
-        </w:rPr>
-        <w:drawing>
-          <wp:inline distT="0" distB="0" distL="0" distR="0" wp14:anchorId="0FC19E3F" wp14:editId="0B6361C2">
-            <wp:extent cx="3060000" cy="2298560"/>
-            <wp:effectExtent l="190500" t="190500" r="198120" b="197485"/>
-            <wp:docPr id="1316592766" name="Picture 1"/>
-            <wp:cNvGraphicFramePr>
-              <a:graphicFrameLocks xmlns:a="http://schemas.openxmlformats.org/drawingml/2006/main" noChangeAspect="1"/>
-            </wp:cNvGraphicFramePr>
-            <a:graphic xmlns:a="http://schemas.openxmlformats.org/drawingml/2006/main">
-              <a:graphicData uri="http://schemas.openxmlformats.org/drawingml/2006/picture">
-                <pic:pic xmlns:pic="http://schemas.openxmlformats.org/drawingml/2006/picture">
-                  <pic:nvPicPr>
-                    <pic:cNvPr id="1316592766" name=""/>
-                    <pic:cNvPicPr/>
-                  </pic:nvPicPr>
-                  <pic:blipFill>
-                    <a:blip r:embed="rId41"/>
-                    <a:stretch>
-                      <a:fillRect/>
-                    </a:stretch>
-                  </pic:blipFill>
-                  <pic:spPr>
-                    <a:xfrm>
-                      <a:off x="0" y="0"/>
-                      <a:ext cx="3060000" cy="2298560"/>
-                    </a:xfrm>
-                    <a:prstGeom prst="rect">
-                      <a:avLst/>
-                    </a:prstGeom>
-                    <a:ln>
-                      <a:noFill/>
-                    </a:ln>
-                    <a:effectLst>
-                      <a:outerShdw blurRad="190500" algn="tl" rotWithShape="0">
-                        <a:srgbClr val="000000">
-                          <a:alpha val="70000"/>
-                        </a:srgbClr>
-                      </a:outerShdw>
-                    </a:effectLst>
-                  </pic:spPr>
-                </pic:pic>
-              </a:graphicData>
-            </a:graphic>
-          </wp:inline>
-        </w:drawing>
-      </w:r>
     </w:p>
     <w:p>
       <w:pPr>
@@ -10191,8 +8990,8 @@
         <w:tblLook w:val="04A0" w:firstRow="1" w:lastRow="0" w:firstColumn="1" w:lastColumn="0" w:noHBand="0" w:noVBand="1"/>
       </w:tblPr>
       <w:tblGrid>
-        <w:gridCol w:w="4513"/>
-        <w:gridCol w:w="4513"/>
+        <w:gridCol w:w="4508"/>
+        <w:gridCol w:w="4508"/>
       </w:tblGrid>
       <w:tr>
         <w:tc>
@@ -10208,60 +9007,6 @@
                 <w:rtl/>
               </w:rPr>
             </w:pPr>
-            <w:r>
-              <w:rPr>
-                <w:rFonts w:ascii="Segoe UI" w:hAnsi="Segoe UI" w:cs="Segoe UI"/>
-                <w:noProof/>
-                <w:sz w:val="18"/>
-                <w:szCs w:val="18"/>
-                <w:rtl/>
-              </w:rPr>
-              <w:drawing>
-                <wp:inline distT="0" distB="0" distL="0" distR="0" wp14:anchorId="53EE8849" wp14:editId="00EF3715">
-                  <wp:extent cx="2520000" cy="2544290"/>
-                  <wp:effectExtent l="190500" t="190500" r="185420" b="199390"/>
-                  <wp:docPr id="121834229" name="Picture 1"/>
-                  <wp:cNvGraphicFramePr>
-                    <a:graphicFrameLocks xmlns:a="http://schemas.openxmlformats.org/drawingml/2006/main" noChangeAspect="1"/>
-                  </wp:cNvGraphicFramePr>
-                  <a:graphic xmlns:a="http://schemas.openxmlformats.org/drawingml/2006/main">
-                    <a:graphicData uri="http://schemas.openxmlformats.org/drawingml/2006/picture">
-                      <pic:pic xmlns:pic="http://schemas.openxmlformats.org/drawingml/2006/picture">
-                        <pic:nvPicPr>
-                          <pic:cNvPr id="121834229" name=""/>
-                          <pic:cNvPicPr/>
-                        </pic:nvPicPr>
-                        <pic:blipFill>
-                          <a:blip r:embed="rId42"/>
-                          <a:stretch>
-                            <a:fillRect/>
-                          </a:stretch>
-                        </pic:blipFill>
-                        <pic:spPr>
-                          <a:xfrm>
-                            <a:off x="0" y="0"/>
-                            <a:ext cx="2520000" cy="2544290"/>
-                          </a:xfrm>
-                          <a:prstGeom prst="rect">
-                            <a:avLst/>
-                          </a:prstGeom>
-                          <a:ln>
-                            <a:noFill/>
-                          </a:ln>
-                          <a:effectLst>
-                            <a:outerShdw blurRad="190500" algn="tl" rotWithShape="0">
-                              <a:srgbClr val="000000">
-                                <a:alpha val="70000"/>
-                              </a:srgbClr>
-                            </a:outerShdw>
-                          </a:effectLst>
-                        </pic:spPr>
-                      </pic:pic>
-                    </a:graphicData>
-                  </a:graphic>
-                </wp:inline>
-              </w:drawing>
-            </w:r>
           </w:p>
         </w:tc>
         <w:tc>
@@ -10277,60 +9022,6 @@
                 <w:rtl/>
               </w:rPr>
             </w:pPr>
-            <w:r>
-              <w:rPr>
-                <w:rFonts w:ascii="Segoe UI" w:hAnsi="Segoe UI" w:cs="Segoe UI"/>
-                <w:noProof/>
-                <w:sz w:val="18"/>
-                <w:szCs w:val="18"/>
-                <w:rtl/>
-              </w:rPr>
-              <w:drawing>
-                <wp:inline distT="0" distB="0" distL="0" distR="0" wp14:anchorId="07BB381F" wp14:editId="3464B143">
-                  <wp:extent cx="2520000" cy="2179385"/>
-                  <wp:effectExtent l="190500" t="190500" r="185420" b="182880"/>
-                  <wp:docPr id="778786311" name="Picture 1"/>
-                  <wp:cNvGraphicFramePr>
-                    <a:graphicFrameLocks xmlns:a="http://schemas.openxmlformats.org/drawingml/2006/main" noChangeAspect="1"/>
-                  </wp:cNvGraphicFramePr>
-                  <a:graphic xmlns:a="http://schemas.openxmlformats.org/drawingml/2006/main">
-                    <a:graphicData uri="http://schemas.openxmlformats.org/drawingml/2006/picture">
-                      <pic:pic xmlns:pic="http://schemas.openxmlformats.org/drawingml/2006/picture">
-                        <pic:nvPicPr>
-                          <pic:cNvPr id="778786311" name=""/>
-                          <pic:cNvPicPr/>
-                        </pic:nvPicPr>
-                        <pic:blipFill>
-                          <a:blip r:embed="rId43"/>
-                          <a:stretch>
-                            <a:fillRect/>
-                          </a:stretch>
-                        </pic:blipFill>
-                        <pic:spPr>
-                          <a:xfrm>
-                            <a:off x="0" y="0"/>
-                            <a:ext cx="2520000" cy="2179385"/>
-                          </a:xfrm>
-                          <a:prstGeom prst="rect">
-                            <a:avLst/>
-                          </a:prstGeom>
-                          <a:ln>
-                            <a:noFill/>
-                          </a:ln>
-                          <a:effectLst>
-                            <a:outerShdw blurRad="190500" algn="tl" rotWithShape="0">
-                              <a:srgbClr val="000000">
-                                <a:alpha val="70000"/>
-                              </a:srgbClr>
-                            </a:outerShdw>
-                          </a:effectLst>
-                        </pic:spPr>
-                      </pic:pic>
-                    </a:graphicData>
-                  </a:graphic>
-                </wp:inline>
-              </w:drawing>
-            </w:r>
           </w:p>
         </w:tc>
       </w:tr>
@@ -10360,7 +9051,6 @@
           <w:szCs w:val="18"/>
           <w:rtl/>
         </w:rPr>
-        <w:lastRenderedPageBreak/>
         <w:t>از کشوي آزمون ها يک امتحان را انتخاب و وارد شويد.</w:t>
       </w:r>
     </w:p>
@@ -10435,8 +9125,8 @@
         <w:tblLook w:val="04A0" w:firstRow="1" w:lastRow="0" w:firstColumn="1" w:lastColumn="0" w:noHBand="0" w:noVBand="1"/>
       </w:tblPr>
       <w:tblGrid>
-        <w:gridCol w:w="4513"/>
-        <w:gridCol w:w="4513"/>
+        <w:gridCol w:w="4508"/>
+        <w:gridCol w:w="4508"/>
       </w:tblGrid>
       <w:tr>
         <w:tc>
@@ -10452,60 +9142,6 @@
                 <w:rtl/>
               </w:rPr>
             </w:pPr>
-            <w:r>
-              <w:rPr>
-                <w:rFonts w:ascii="Segoe UI" w:hAnsi="Segoe UI" w:cs="Segoe UI"/>
-                <w:noProof/>
-                <w:sz w:val="18"/>
-                <w:szCs w:val="18"/>
-                <w:rtl/>
-              </w:rPr>
-              <w:drawing>
-                <wp:inline distT="0" distB="0" distL="0" distR="0" wp14:anchorId="53627858" wp14:editId="03AFA93B">
-                  <wp:extent cx="2520000" cy="1820341"/>
-                  <wp:effectExtent l="190500" t="190500" r="185420" b="199390"/>
-                  <wp:docPr id="673104754" name="Picture 1"/>
-                  <wp:cNvGraphicFramePr>
-                    <a:graphicFrameLocks xmlns:a="http://schemas.openxmlformats.org/drawingml/2006/main" noChangeAspect="1"/>
-                  </wp:cNvGraphicFramePr>
-                  <a:graphic xmlns:a="http://schemas.openxmlformats.org/drawingml/2006/main">
-                    <a:graphicData uri="http://schemas.openxmlformats.org/drawingml/2006/picture">
-                      <pic:pic xmlns:pic="http://schemas.openxmlformats.org/drawingml/2006/picture">
-                        <pic:nvPicPr>
-                          <pic:cNvPr id="673104754" name=""/>
-                          <pic:cNvPicPr/>
-                        </pic:nvPicPr>
-                        <pic:blipFill>
-                          <a:blip r:embed="rId44"/>
-                          <a:stretch>
-                            <a:fillRect/>
-                          </a:stretch>
-                        </pic:blipFill>
-                        <pic:spPr>
-                          <a:xfrm>
-                            <a:off x="0" y="0"/>
-                            <a:ext cx="2520000" cy="1820341"/>
-                          </a:xfrm>
-                          <a:prstGeom prst="rect">
-                            <a:avLst/>
-                          </a:prstGeom>
-                          <a:ln>
-                            <a:noFill/>
-                          </a:ln>
-                          <a:effectLst>
-                            <a:outerShdw blurRad="190500" algn="tl" rotWithShape="0">
-                              <a:srgbClr val="000000">
-                                <a:alpha val="70000"/>
-                              </a:srgbClr>
-                            </a:outerShdw>
-                          </a:effectLst>
-                        </pic:spPr>
-                      </pic:pic>
-                    </a:graphicData>
-                  </a:graphic>
-                </wp:inline>
-              </w:drawing>
-            </w:r>
           </w:p>
         </w:tc>
         <w:tc>
@@ -10521,60 +9157,6 @@
                 <w:rtl/>
               </w:rPr>
             </w:pPr>
-            <w:r>
-              <w:rPr>
-                <w:rFonts w:ascii="Segoe UI" w:hAnsi="Segoe UI" w:cs="Segoe UI"/>
-                <w:noProof/>
-                <w:sz w:val="18"/>
-                <w:szCs w:val="18"/>
-                <w:rtl/>
-              </w:rPr>
-              <w:drawing>
-                <wp:inline distT="0" distB="0" distL="0" distR="0" wp14:anchorId="7CA57986" wp14:editId="7333F294">
-                  <wp:extent cx="2520000" cy="2943257"/>
-                  <wp:effectExtent l="190500" t="190500" r="185420" b="180975"/>
-                  <wp:docPr id="1987959709" name="Picture 1"/>
-                  <wp:cNvGraphicFramePr>
-                    <a:graphicFrameLocks xmlns:a="http://schemas.openxmlformats.org/drawingml/2006/main" noChangeAspect="1"/>
-                  </wp:cNvGraphicFramePr>
-                  <a:graphic xmlns:a="http://schemas.openxmlformats.org/drawingml/2006/main">
-                    <a:graphicData uri="http://schemas.openxmlformats.org/drawingml/2006/picture">
-                      <pic:pic xmlns:pic="http://schemas.openxmlformats.org/drawingml/2006/picture">
-                        <pic:nvPicPr>
-                          <pic:cNvPr id="1987959709" name=""/>
-                          <pic:cNvPicPr/>
-                        </pic:nvPicPr>
-                        <pic:blipFill>
-                          <a:blip r:embed="rId45"/>
-                          <a:stretch>
-                            <a:fillRect/>
-                          </a:stretch>
-                        </pic:blipFill>
-                        <pic:spPr>
-                          <a:xfrm>
-                            <a:off x="0" y="0"/>
-                            <a:ext cx="2520000" cy="2943257"/>
-                          </a:xfrm>
-                          <a:prstGeom prst="rect">
-                            <a:avLst/>
-                          </a:prstGeom>
-                          <a:ln>
-                            <a:noFill/>
-                          </a:ln>
-                          <a:effectLst>
-                            <a:outerShdw blurRad="190500" algn="tl" rotWithShape="0">
-                              <a:srgbClr val="000000">
-                                <a:alpha val="70000"/>
-                              </a:srgbClr>
-                            </a:outerShdw>
-                          </a:effectLst>
-                        </pic:spPr>
-                      </pic:pic>
-                    </a:graphicData>
-                  </a:graphic>
-                </wp:inline>
-              </w:drawing>
-            </w:r>
           </w:p>
         </w:tc>
       </w:tr>
@@ -10694,78 +9276,23 @@
           <w:rtl/>
         </w:rPr>
       </w:pPr>
-      <w:r>
-        <w:rPr>
-          <w:rFonts w:ascii="Segoe UI" w:hAnsi="Segoe UI" w:cs="Segoe UI"/>
-          <w:noProof/>
-          <w:sz w:val="18"/>
-          <w:szCs w:val="18"/>
-          <w:rtl/>
-        </w:rPr>
-        <w:drawing>
-          <wp:inline distT="0" distB="0" distL="0" distR="0" wp14:anchorId="1C2D992B" wp14:editId="71FD73AF">
-            <wp:extent cx="2520000" cy="2691425"/>
-            <wp:effectExtent l="190500" t="190500" r="185420" b="185420"/>
-            <wp:docPr id="1894396194" name="Picture 1"/>
-            <wp:cNvGraphicFramePr>
-              <a:graphicFrameLocks xmlns:a="http://schemas.openxmlformats.org/drawingml/2006/main" noChangeAspect="1"/>
-            </wp:cNvGraphicFramePr>
-            <a:graphic xmlns:a="http://schemas.openxmlformats.org/drawingml/2006/main">
-              <a:graphicData uri="http://schemas.openxmlformats.org/drawingml/2006/picture">
-                <pic:pic xmlns:pic="http://schemas.openxmlformats.org/drawingml/2006/picture">
-                  <pic:nvPicPr>
-                    <pic:cNvPr id="1894396194" name=""/>
-                    <pic:cNvPicPr/>
-                  </pic:nvPicPr>
-                  <pic:blipFill>
-                    <a:blip r:embed="rId46"/>
-                    <a:stretch>
-                      <a:fillRect/>
-                    </a:stretch>
-                  </pic:blipFill>
-                  <pic:spPr>
-                    <a:xfrm>
-                      <a:off x="0" y="0"/>
-                      <a:ext cx="2520000" cy="2691425"/>
-                    </a:xfrm>
-                    <a:prstGeom prst="rect">
-                      <a:avLst/>
-                    </a:prstGeom>
-                    <a:ln>
-                      <a:noFill/>
-                    </a:ln>
-                    <a:effectLst>
-                      <a:outerShdw blurRad="190500" algn="tl" rotWithShape="0">
-                        <a:srgbClr val="000000">
-                          <a:alpha val="70000"/>
-                        </a:srgbClr>
-                      </a:outerShdw>
-                    </a:effectLst>
-                  </pic:spPr>
-                </pic:pic>
-              </a:graphicData>
-            </a:graphic>
-          </wp:inline>
-        </w:drawing>
-      </w:r>
-    </w:p>
-    <w:p>
-      <w:pPr>
-        <w:rPr>
-          <w:rFonts w:ascii="Segoe UI" w:hAnsi="Segoe UI" w:cs="Segoe UI"/>
-          <w:sz w:val="18"/>
-          <w:szCs w:val="18"/>
-          <w:rtl/>
-        </w:rPr>
-      </w:pPr>
-      <w:r>
-        <w:rPr>
-          <w:rFonts w:ascii="Segoe UI" w:hAnsi="Segoe UI" w:cs="Segoe UI" w:hint="cs"/>
-          <w:sz w:val="18"/>
-          <w:szCs w:val="18"/>
-          <w:rtl/>
-        </w:rPr>
-        <w:lastRenderedPageBreak/>
+    </w:p>
+    <w:p>
+      <w:pPr>
+        <w:rPr>
+          <w:rFonts w:ascii="Segoe UI" w:hAnsi="Segoe UI" w:cs="Segoe UI"/>
+          <w:sz w:val="18"/>
+          <w:szCs w:val="18"/>
+          <w:rtl/>
+        </w:rPr>
+      </w:pPr>
+      <w:r>
+        <w:rPr>
+          <w:rFonts w:ascii="Segoe UI" w:hAnsi="Segoe UI" w:cs="Segoe UI" w:hint="cs"/>
+          <w:sz w:val="18"/>
+          <w:szCs w:val="18"/>
+          <w:rtl/>
+        </w:rPr>
         <w:t>هنگام مشاهده برگه آزمون، مي توانيد علاوه بر نمودار درصد پاسخگويي خودتان به سوالات، آمار مربوط به پاسخ گويي به هر سوال توسط ساير دانشجويان را مشاهده کنيد.</w:t>
       </w:r>
     </w:p>
@@ -10779,60 +9306,6 @@
           <w:rtl/>
         </w:rPr>
       </w:pPr>
-      <w:r>
-        <w:rPr>
-          <w:rFonts w:ascii="Segoe UI" w:hAnsi="Segoe UI" w:cs="Segoe UI"/>
-          <w:noProof/>
-          <w:sz w:val="18"/>
-          <w:szCs w:val="18"/>
-          <w:rtl/>
-        </w:rPr>
-        <w:drawing>
-          <wp:inline distT="0" distB="0" distL="0" distR="0" wp14:anchorId="3C52FF94" wp14:editId="6CEE5044">
-            <wp:extent cx="2520000" cy="3378241"/>
-            <wp:effectExtent l="190500" t="190500" r="185420" b="184150"/>
-            <wp:docPr id="1022524787" name="Picture 1"/>
-            <wp:cNvGraphicFramePr>
-              <a:graphicFrameLocks xmlns:a="http://schemas.openxmlformats.org/drawingml/2006/main" noChangeAspect="1"/>
-            </wp:cNvGraphicFramePr>
-            <a:graphic xmlns:a="http://schemas.openxmlformats.org/drawingml/2006/main">
-              <a:graphicData uri="http://schemas.openxmlformats.org/drawingml/2006/picture">
-                <pic:pic xmlns:pic="http://schemas.openxmlformats.org/drawingml/2006/picture">
-                  <pic:nvPicPr>
-                    <pic:cNvPr id="1022524787" name=""/>
-                    <pic:cNvPicPr/>
-                  </pic:nvPicPr>
-                  <pic:blipFill>
-                    <a:blip r:embed="rId47"/>
-                    <a:stretch>
-                      <a:fillRect/>
-                    </a:stretch>
-                  </pic:blipFill>
-                  <pic:spPr>
-                    <a:xfrm>
-                      <a:off x="0" y="0"/>
-                      <a:ext cx="2520000" cy="3378241"/>
-                    </a:xfrm>
-                    <a:prstGeom prst="rect">
-                      <a:avLst/>
-                    </a:prstGeom>
-                    <a:ln>
-                      <a:noFill/>
-                    </a:ln>
-                    <a:effectLst>
-                      <a:outerShdw blurRad="190500" algn="tl" rotWithShape="0">
-                        <a:srgbClr val="000000">
-                          <a:alpha val="70000"/>
-                        </a:srgbClr>
-                      </a:outerShdw>
-                    </a:effectLst>
-                  </pic:spPr>
-                </pic:pic>
-              </a:graphicData>
-            </a:graphic>
-          </wp:inline>
-        </w:drawing>
-      </w:r>
     </w:p>
     <w:p>
       <w:pPr>
@@ -16310,6 +14783,7 @@
   <w:style w:type="character" w:default="1" w:styleId="DefaultParagraphFont">
     <w:name w:val="Default Paragraph Font"/>
     <w:uiPriority w:val="1"/>
+    <w:semiHidden/>
     <w:unhideWhenUsed/>
   </w:style>
   <w:style w:type="table" w:default="1" w:styleId="TableNormal">

</xml_diff>